<commit_message>
Add top 100 results CSV file with performance metrics for various models
</commit_message>
<xml_diff>
--- a/proposal/فرم پروپوزال کارشناسی.docx
+++ b/proposal/فرم پروپوزال کارشناسی.docx
@@ -381,22 +381,38 @@
             <w:gridSpan w:val="4"/>
           </w:tcPr>
           <w:p>
-            <w:pPr>
-              <w:rPr>
-                <w:rFonts w:ascii="2Lotus_8_0_04061440" w:hAnsi="2Lotus_8_0_04061440" w:cs="B Mitra"/>
-                <w:sz w:val="28"/>
-                <w:szCs w:val="28"/>
-                <w:rtl/>
-              </w:rPr>
-            </w:pPr>
-            <w:r>
-              <w:rPr>
-                <w:rFonts w:ascii="2Lotus_8_0_04061440" w:hAnsi="2Lotus_8_0_04061440" w:cs="B Mitra"/>
-                <w:sz w:val="28"/>
-                <w:szCs w:val="28"/>
-                <w:rtl/>
-              </w:rPr>
-              <w:t>1- عنوان پروژه کارشناسي</w:t>
+            <w:r/>
+          </w:p>
+          <w:p>
+            <w:pPr>
+              <w:bidi w:val="1"/>
+              <w:jc w:val="right"/>
+            </w:pPr>
+            <w:r>
+              <w:rPr>
+                <w:b/>
+                <w:sz w:val="22"/>
+              </w:rPr>
+              <w:t xml:space="preserve">1- عنوان پروژه کارشناسی: </w:t>
+            </w:r>
+            <w:r>
+              <w:rPr>
+                <w:sz w:val="22"/>
+              </w:rPr>
+              <w:t>طراحی، ارزیابی تجربی و فشرده‌سازی مکانیزم‌های توجه خطی و تجزیه مقادیر منفرد (SVD) در مدل‌های زبانی بزرگ مبتنی بر ترنسفورمر</w:t>
+            </w:r>
+          </w:p>
+          <w:p>
+            <w:pPr>
+              <w:jc w:val="left"/>
+            </w:pPr>
+            <w:r>
+              <w:rPr>
+                <w:rFonts w:ascii="Times New Roman" w:hAnsi="Times New Roman"/>
+                <w:i/>
+                <w:sz w:val="20"/>
+              </w:rPr>
+              <w:t>NeuralOps: A Hardware-Aware Framework for SVD Linear Attention and Transformer Model Compression</w:t>
             </w:r>
           </w:p>
         </w:tc>
@@ -582,14 +598,9 @@
             <w:tcW w:w="2621" w:type="dxa"/>
           </w:tcPr>
           <w:p>
-            <w:pPr>
-              <w:rPr>
-                <w:rFonts w:ascii="2Lotus_8_0_04061440" w:hAnsi="2Lotus_8_0_04061440" w:cs="B Mitra"/>
-                <w:sz w:val="28"/>
-                <w:szCs w:val="28"/>
-                <w:rtl/>
-              </w:rPr>
-            </w:pPr>
+            <w:r>
+              <w:t>دکتر احمد کلهر</w:t>
+            </w:r>
           </w:p>
         </w:tc>
         <w:tc>
@@ -597,14 +608,9 @@
             <w:tcW w:w="2831" w:type="dxa"/>
           </w:tcPr>
           <w:p>
-            <w:pPr>
-              <w:rPr>
-                <w:rFonts w:ascii="2Lotus_8_0_04061440" w:hAnsi="2Lotus_8_0_04061440" w:cs="B Mitra"/>
-                <w:sz w:val="28"/>
-                <w:szCs w:val="28"/>
-                <w:rtl/>
-              </w:rPr>
-            </w:pPr>
+            <w:r>
+              <w:t>استادیار / دانشیار</w:t>
+            </w:r>
           </w:p>
         </w:tc>
         <w:tc>
@@ -613,14 +619,9 @@
             <w:gridSpan w:val="2"/>
           </w:tcPr>
           <w:p>
-            <w:pPr>
-              <w:rPr>
-                <w:rFonts w:ascii="2Lotus_8_0_04061440" w:hAnsi="2Lotus_8_0_04061440" w:cs="B Mitra"/>
-                <w:sz w:val="28"/>
-                <w:szCs w:val="28"/>
-                <w:rtl/>
-              </w:rPr>
-            </w:pPr>
+            <w:r>
+              <w:t>دانشکده مهندسی برق و کامپیوتر</w:t>
+            </w:r>
           </w:p>
         </w:tc>
       </w:tr>
@@ -657,14 +658,9 @@
             <w:tcW w:w="2621" w:type="dxa"/>
           </w:tcPr>
           <w:p>
-            <w:pPr>
-              <w:rPr>
-                <w:rFonts w:ascii="2Lotus_8_0_04061440" w:hAnsi="2Lotus_8_0_04061440" w:cs="B Mitra"/>
-                <w:sz w:val="28"/>
-                <w:szCs w:val="28"/>
-                <w:rtl/>
-              </w:rPr>
-            </w:pPr>
+            <w:r>
+              <w:t>تعیین توسط گروه آموزش</w:t>
+            </w:r>
           </w:p>
         </w:tc>
         <w:tc>
@@ -672,14 +668,9 @@
             <w:tcW w:w="2831" w:type="dxa"/>
           </w:tcPr>
           <w:p>
-            <w:pPr>
-              <w:rPr>
-                <w:rFonts w:ascii="2Lotus_8_0_04061440" w:hAnsi="2Lotus_8_0_04061440" w:cs="B Mitra"/>
-                <w:sz w:val="28"/>
-                <w:szCs w:val="28"/>
-                <w:rtl/>
-              </w:rPr>
-            </w:pPr>
+            <w:r>
+              <w:t>-</w:t>
+            </w:r>
           </w:p>
         </w:tc>
         <w:tc>
@@ -688,14 +679,9 @@
             <w:gridSpan w:val="2"/>
           </w:tcPr>
           <w:p>
-            <w:pPr>
-              <w:rPr>
-                <w:rFonts w:ascii="2Lotus_8_0_04061440" w:hAnsi="2Lotus_8_0_04061440" w:cs="B Mitra"/>
-                <w:sz w:val="28"/>
-                <w:szCs w:val="28"/>
-                <w:rtl/>
-              </w:rPr>
-            </w:pPr>
+            <w:r>
+              <w:t>دانشکده مهندسی برق و کامپیوتر</w:t>
+            </w:r>
           </w:p>
         </w:tc>
       </w:tr>
@@ -711,72 +697,30 @@
             <w:gridSpan w:val="4"/>
           </w:tcPr>
           <w:p>
-            <w:pPr>
-              <w:rPr>
-                <w:rFonts w:ascii="2Lotus_8_0_04061440" w:hAnsi="2Lotus_8_0_04061440" w:cs="B Mitra"/>
-                <w:sz w:val="28"/>
-                <w:szCs w:val="28"/>
-                <w:rtl/>
-              </w:rPr>
-            </w:pPr>
-            <w:r>
-              <w:rPr>
-                <w:rFonts w:ascii="2Lotus_8_0_04061440" w:hAnsi="2Lotus_8_0_04061440" w:cs="B Mitra"/>
-                <w:sz w:val="28"/>
-                <w:szCs w:val="28"/>
-                <w:rtl/>
-              </w:rPr>
-              <w:t xml:space="preserve">3- </w:t>
-            </w:r>
-            <w:r>
-              <w:rPr>
-                <w:rFonts w:ascii="2Lotus_8_0_04061440" w:hAnsi="2Lotus_8_0_04061440" w:cs="B Mitra"/>
-                <w:sz w:val="28"/>
-                <w:szCs w:val="28"/>
-                <w:u w:val="single"/>
-                <w:rtl/>
-              </w:rPr>
-              <w:t>مشخصات دانشجو</w:t>
-            </w:r>
-          </w:p>
-          <w:p>
-            <w:pPr>
-              <w:rPr>
-                <w:rFonts w:ascii="2Lotus_8_0_04061440" w:hAnsi="2Lotus_8_0_04061440" w:cs="B Mitra"/>
-                <w:sz w:val="28"/>
-                <w:szCs w:val="28"/>
-                <w:rtl/>
-              </w:rPr>
-            </w:pPr>
-          </w:p>
-          <w:p>
-            <w:pPr>
-              <w:rPr>
-                <w:rFonts w:ascii="2Lotus_8_0_04061440" w:hAnsi="2Lotus_8_0_04061440" w:cs="B Mitra"/>
-                <w:sz w:val="16"/>
-                <w:szCs w:val="16"/>
-                <w:rtl/>
-              </w:rPr>
-            </w:pPr>
-            <w:r>
-              <w:rPr>
-                <w:rFonts w:ascii="2Lotus_8_0_04061440" w:hAnsi="2Lotus_8_0_04061440" w:cs="B Mitra"/>
-                <w:sz w:val="28"/>
-                <w:szCs w:val="28"/>
-                <w:rtl/>
-              </w:rPr>
-              <w:t>نام و نام خانوادگي :                                  شماره دانشجويي :                                    رشته و گرايش :</w:t>
-            </w:r>
-          </w:p>
-          <w:p>
-            <w:pPr>
-              <w:rPr>
-                <w:rFonts w:ascii="2Lotus_8_0_04061440" w:hAnsi="2Lotus_8_0_04061440" w:cs="B Mitra"/>
-                <w:sz w:val="16"/>
-                <w:szCs w:val="16"/>
-                <w:rtl/>
-              </w:rPr>
-            </w:pPr>
+            <w:r/>
+          </w:p>
+          <w:p>
+            <w:pPr>
+              <w:bidi w:val="1"/>
+              <w:jc w:val="right"/>
+            </w:pPr>
+            <w:r>
+              <w:rPr>
+                <w:b/>
+                <w:sz w:val="22"/>
+              </w:rPr>
+              <w:t>3- مشخصات دانشجو:</w:t>
+              <w:br/>
+            </w:r>
+          </w:p>
+          <w:p>
+            <w:pPr>
+              <w:bidi w:val="1"/>
+              <w:jc w:val="right"/>
+            </w:pPr>
+            <w:r>
+              <w:t>نام و نام خانوادگی: محمد طاها مجلسی      |      شماره دانشجویی: 810101504      |      رشته و گرایش: مهندسی کامپیوتر - نرم‌افزار</w:t>
+            </w:r>
           </w:p>
         </w:tc>
       </w:tr>
@@ -792,62 +736,18 @@
             <w:gridSpan w:val="4"/>
           </w:tcPr>
           <w:p>
-            <w:pPr>
-              <w:rPr>
-                <w:rFonts w:ascii="2Lotus_8_0_04061440" w:hAnsi="2Lotus_8_0_04061440" w:cs="B Mitra"/>
-                <w:sz w:val="28"/>
-                <w:szCs w:val="28"/>
-                <w:rtl/>
-              </w:rPr>
-            </w:pPr>
-            <w:r>
-              <w:rPr>
-                <w:rFonts w:ascii="2Lotus_8_0_04061440" w:hAnsi="2Lotus_8_0_04061440" w:cs="B Mitra"/>
-                <w:sz w:val="28"/>
-                <w:szCs w:val="28"/>
-                <w:rtl/>
-              </w:rPr>
-              <w:t>4- نيمسال اخذ واحد پروژه : نيم سال اول /  دوم سال تحصيلي :</w:t>
-            </w:r>
-          </w:p>
-          <w:p>
-            <w:pPr>
-              <w:rPr>
-                <w:rFonts w:ascii="2Lotus_8_0_04061440" w:hAnsi="2Lotus_8_0_04061440" w:cs="B Mitra"/>
-                <w:sz w:val="28"/>
-                <w:szCs w:val="28"/>
-                <w:rtl/>
-              </w:rPr>
-            </w:pPr>
-          </w:p>
-          <w:p>
-            <w:pPr>
-              <w:rPr>
-                <w:rFonts w:ascii="2Lotus_8_0_04061440" w:hAnsi="2Lotus_8_0_04061440" w:cs="B Mitra"/>
-                <w:sz w:val="16"/>
-                <w:szCs w:val="16"/>
-                <w:rtl/>
-              </w:rPr>
-            </w:pPr>
-            <w:r>
-              <w:rPr>
-                <w:rFonts w:ascii="2Lotus_8_0_04061440" w:hAnsi="2Lotus_8_0_04061440" w:cs="B Mitra"/>
-                <w:sz w:val="28"/>
-                <w:szCs w:val="28"/>
-                <w:rtl/>
-              </w:rPr>
-              <w:t>توضيح مهم : اين فرم بايد تا قبل از پايان مهلت حذف و اضافه نيمسال مربوط تکميل شود .</w:t>
-            </w:r>
-          </w:p>
-          <w:p>
-            <w:pPr>
-              <w:rPr>
-                <w:rFonts w:ascii="2Lotus_8_0_04061440" w:hAnsi="2Lotus_8_0_04061440" w:cs="B Mitra"/>
-                <w:sz w:val="16"/>
-                <w:szCs w:val="16"/>
-                <w:rtl/>
-              </w:rPr>
-            </w:pPr>
+            <w:r/>
+          </w:p>
+          <w:p>
+            <w:pPr>
+              <w:bidi w:val="1"/>
+              <w:jc w:val="right"/>
+            </w:pPr>
+            <w:r>
+              <w:t>4- نیمسال اخذ واحد پروژه: نیم‌سال دوم سال تحصیلی 1404-1405 (بهار 1405)</w:t>
+              <w:br/>
+              <w:t>توضیح مهم: این فرم باید تا قبل از پایان مهلت حذف و اضافه نیمسال مربوط تکمیل شود.</w:t>
+            </w:r>
           </w:p>
         </w:tc>
       </w:tr>
@@ -863,208 +763,54 @@
             <w:gridSpan w:val="4"/>
           </w:tcPr>
           <w:p>
-            <w:pPr>
-              <w:rPr>
-                <w:rFonts w:ascii="2Lotus_8_0_04061440" w:hAnsi="2Lotus_8_0_04061440" w:cs="B Mitra"/>
-                <w:sz w:val="28"/>
-                <w:szCs w:val="28"/>
-                <w:rtl/>
-              </w:rPr>
-            </w:pPr>
-            <w:r>
-              <w:rPr>
-                <w:rFonts w:ascii="2Lotus_8_0_04061440" w:hAnsi="2Lotus_8_0_04061440" w:cs="B Mitra"/>
-                <w:sz w:val="28"/>
-                <w:szCs w:val="28"/>
-                <w:rtl/>
-              </w:rPr>
-              <w:t xml:space="preserve">5- </w:t>
-            </w:r>
-            <w:r>
-              <w:rPr>
-                <w:rFonts w:ascii="2Lotus_8_0_04061440" w:hAnsi="2Lotus_8_0_04061440" w:cs="B Mitra"/>
-                <w:sz w:val="28"/>
-                <w:szCs w:val="28"/>
-                <w:u w:val="single"/>
-                <w:rtl/>
-              </w:rPr>
-              <w:t>اطلاعات مربوط به پروژه</w:t>
-            </w:r>
-            <w:r>
-              <w:rPr>
-                <w:rFonts w:ascii="2Lotus_8_0_04061440" w:hAnsi="2Lotus_8_0_04061440" w:cs="B Mitra"/>
-                <w:sz w:val="28"/>
-                <w:szCs w:val="28"/>
-                <w:rtl/>
-              </w:rPr>
-              <w:t xml:space="preserve"> :</w:t>
-            </w:r>
-          </w:p>
-          <w:p>
-            <w:pPr>
-              <w:rPr>
-                <w:rFonts w:ascii="2Lotus_8_0_04061440" w:hAnsi="2Lotus_8_0_04061440" w:cs="B Mitra"/>
-                <w:sz w:val="28"/>
-                <w:szCs w:val="28"/>
-                <w:rtl/>
-              </w:rPr>
-            </w:pPr>
-            <w:r>
-              <w:rPr>
-                <w:rFonts w:ascii="2Lotus_8_0_04061440" w:hAnsi="2Lotus_8_0_04061440" w:cs="B Mitra"/>
-                <w:sz w:val="28"/>
-                <w:szCs w:val="28"/>
-                <w:rtl/>
-              </w:rPr>
-              <w:t>لف- تعريف مساله :</w:t>
-            </w:r>
-          </w:p>
-          <w:p>
-            <w:pPr>
-              <w:rPr>
-                <w:rFonts w:ascii="2Lotus_8_0_04061440" w:hAnsi="2Lotus_8_0_04061440" w:cs="B Mitra"/>
-                <w:sz w:val="28"/>
-                <w:szCs w:val="28"/>
-                <w:rtl/>
-              </w:rPr>
-            </w:pPr>
-          </w:p>
-          <w:p>
-            <w:pPr>
-              <w:rPr>
-                <w:rFonts w:ascii="2Lotus_8_0_04061440" w:hAnsi="2Lotus_8_0_04061440" w:cs="B Mitra"/>
-                <w:sz w:val="28"/>
-                <w:szCs w:val="28"/>
-                <w:rtl/>
-              </w:rPr>
-            </w:pPr>
-          </w:p>
-          <w:p>
-            <w:pPr>
-              <w:rPr>
-                <w:rFonts w:ascii="2Lotus_8_0_04061440" w:hAnsi="2Lotus_8_0_04061440" w:cs="B Mitra"/>
-                <w:sz w:val="28"/>
-                <w:szCs w:val="28"/>
-                <w:rtl/>
-              </w:rPr>
-            </w:pPr>
-          </w:p>
-          <w:p>
-            <w:pPr>
-              <w:rPr>
-                <w:rFonts w:ascii="2Lotus_8_0_04061440" w:hAnsi="2Lotus_8_0_04061440" w:cs="B Mitra"/>
-                <w:sz w:val="28"/>
-                <w:szCs w:val="28"/>
-                <w:rtl/>
-              </w:rPr>
-            </w:pPr>
-          </w:p>
-          <w:p>
-            <w:pPr>
-              <w:rPr>
-                <w:rFonts w:ascii="2Lotus_8_0_04061440" w:hAnsi="2Lotus_8_0_04061440" w:cs="B Mitra"/>
-                <w:sz w:val="28"/>
-                <w:szCs w:val="28"/>
-                <w:rtl/>
-              </w:rPr>
-            </w:pPr>
-          </w:p>
-          <w:p>
-            <w:pPr>
-              <w:rPr>
-                <w:rFonts w:ascii="2Lotus_8_0_04061440" w:hAnsi="2Lotus_8_0_04061440" w:cs="B Mitra"/>
-                <w:sz w:val="28"/>
-                <w:szCs w:val="28"/>
-                <w:rtl/>
-              </w:rPr>
-            </w:pPr>
-          </w:p>
-          <w:p>
-            <w:pPr>
-              <w:rPr>
-                <w:rFonts w:ascii="2Lotus_8_0_04061440" w:hAnsi="2Lotus_8_0_04061440" w:cs="B Mitra"/>
-                <w:sz w:val="28"/>
-                <w:szCs w:val="28"/>
-                <w:rtl/>
-              </w:rPr>
-            </w:pPr>
-          </w:p>
-          <w:p>
-            <w:pPr>
-              <w:rPr>
-                <w:rFonts w:ascii="2Lotus_8_0_04061440" w:hAnsi="2Lotus_8_0_04061440" w:cs="B Mitra"/>
-                <w:sz w:val="28"/>
-                <w:szCs w:val="28"/>
-                <w:rtl/>
-              </w:rPr>
-            </w:pPr>
-          </w:p>
-          <w:p>
-            <w:pPr>
-              <w:rPr>
-                <w:rFonts w:ascii="2Lotus_8_0_04061440" w:hAnsi="2Lotus_8_0_04061440" w:cs="B Mitra"/>
-                <w:sz w:val="28"/>
-                <w:szCs w:val="28"/>
-                <w:rtl/>
-              </w:rPr>
-            </w:pPr>
-            <w:r>
-              <w:rPr>
-                <w:rFonts w:ascii="2Lotus_8_0_04061440" w:hAnsi="2Lotus_8_0_04061440" w:cs="B Mitra"/>
-                <w:sz w:val="28"/>
-                <w:szCs w:val="28"/>
-                <w:rtl/>
-              </w:rPr>
-              <w:t>ب- هدف از طرح مورد نظر ضرو</w:t>
-            </w:r>
-            <w:r>
-              <w:rPr>
-                <w:rFonts w:ascii="2Lotus_8_0_04061440" w:hAnsi="2Lotus_8_0_04061440" w:cs="B Mitra" w:hint="cs"/>
-                <w:sz w:val="28"/>
-                <w:szCs w:val="28"/>
-                <w:rtl/>
-              </w:rPr>
-              <w:t>ر</w:t>
-            </w:r>
-            <w:r>
-              <w:rPr>
-                <w:rFonts w:ascii="2Lotus_8_0_04061440" w:hAnsi="2Lotus_8_0_04061440" w:cs="B Mitra"/>
-                <w:sz w:val="28"/>
-                <w:szCs w:val="28"/>
-                <w:rtl/>
-              </w:rPr>
-              <w:t>ت انجام آن :</w:t>
-            </w:r>
-          </w:p>
-          <w:p>
-            <w:pPr>
-              <w:rPr>
-                <w:rFonts w:ascii="2Lotus_8_0_04061440" w:hAnsi="2Lotus_8_0_04061440" w:cs="B Mitra"/>
-                <w:sz w:val="28"/>
-                <w:szCs w:val="28"/>
-                <w:rtl/>
-              </w:rPr>
-            </w:pPr>
-          </w:p>
-          <w:p>
-            <w:pPr>
-              <w:rPr>
-                <w:rFonts w:ascii="2Lotus_8_0_04061440" w:hAnsi="2Lotus_8_0_04061440" w:cs="B Mitra"/>
-                <w:sz w:val="28"/>
-                <w:szCs w:val="28"/>
-                <w:rtl/>
-              </w:rPr>
-            </w:pPr>
-          </w:p>
-          <w:p>
-            <w:pPr>
-              <w:rPr>
-                <w:rFonts w:ascii="2Lotus_8_0_04061440" w:hAnsi="2Lotus_8_0_04061440" w:cs="B Mitra"/>
-                <w:sz w:val="28"/>
-                <w:szCs w:val="28"/>
-                <w:rtl/>
-              </w:rPr>
-            </w:pPr>
+            <w:r/>
+          </w:p>
+          <w:p>
+            <w:pPr>
+              <w:bidi w:val="1"/>
+              <w:jc w:val="right"/>
+            </w:pPr>
+            <w:r>
+              <w:rPr>
+                <w:b/>
+                <w:sz w:val="22"/>
+              </w:rPr>
+              <w:t>5- اطلاعات مربوط به پروژه:</w:t>
+              <w:br/>
+            </w:r>
+          </w:p>
+          <w:p>
+            <w:pPr>
+              <w:bidi w:val="1"/>
+              <w:jc w:val="right"/>
+            </w:pPr>
+            <w:r>
+              <w:rPr>
+                <w:b/>
+              </w:rPr>
+              <w:t>الف- تعریف مسأله:</w:t>
+              <w:br/>
+            </w:r>
+            <w:r>
+              <w:t>مدل‌های زبانی بزرگ مبتنی بر ترنسفورمر به دلیل استفاده از مکانیزم توجه استاندارد (Softmax Self-Attention)، با پیچیدگی محاسباتی و حافظه‌ای درجه‌دو (O(N²)) مواجه هستند که گلوگاه شدیدی در طول دنباله‌های بلند و استقرار روی کارت‌های گرافیکی ایجاد می‌کند. رویکردهای نوین توجه خطی و تقریب‌های کم‌مرتبه SVD اگرچه از نظر تئوری خطی O(N) هستند، در پیاده‌سازی سخت‌افزاری به دلیل افت نسبت محاسبات به حافظه (Arithmetic Intensity) و اشباع حالت در دنباله‌های طولانی دچار افت سرعت و پایداری می‌شوند.</w:t>
+            </w:r>
+          </w:p>
+          <w:p>
+            <w:pPr>
+              <w:bidi w:val="1"/>
+              <w:jc w:val="right"/>
+            </w:pPr>
+            <w:r>
+              <w:rPr>
+                <w:b/>
+              </w:rPr>
+              <w:br/>
+              <w:t>ب- هدف از طرح مورد نظر و ضرورت انجام آن:</w:t>
+              <w:br/>
+            </w:r>
+            <w:r>
+              <w:t>توسعه چارچوب یکپارچه و سخت‌افزار-آگاه (Hardware-Aware) به نام NeuralOps جهت تزریق، فشرده‌سازی و ارزیابی تجربی بیش از ۲۰۰ مکانیزم توجه خطی و موتور فشرده‌سازی مبتنی بر SVD در ترنسفورمرها. ضرورت این پژوهش در کاهش تاخیر تا ۵۰٪ و مصرف حافظه تا ۴۰٪ در کنار حفظ بیش از ۹۸٪ دقت تسک‌های زبانی جهت اجرای بهینه مدل‌ها روی سیستم‌های توزیع‌شده و پردازنده‌های گرافیکی محدود است.</w:t>
+            </w:r>
           </w:p>
         </w:tc>
       </w:tr>
@@ -1089,281 +835,96 @@
             <w:tcW w:w="10774" w:type="dxa"/>
           </w:tcPr>
           <w:p>
-            <w:pPr>
-              <w:rPr>
-                <w:rFonts w:ascii="2Lotus_8_0_04061440" w:hAnsi="2Lotus_8_0_04061440" w:cs="B Mitra"/>
-                <w:sz w:val="28"/>
-                <w:szCs w:val="28"/>
-                <w:rtl/>
-              </w:rPr>
-            </w:pPr>
-            <w:r>
-              <w:rPr>
-                <w:rFonts w:ascii="2Lotus_8_0_04061440" w:hAnsi="2Lotus_8_0_04061440" w:cs="B Mitra"/>
-                <w:sz w:val="28"/>
-                <w:szCs w:val="28"/>
-                <w:rtl/>
-              </w:rPr>
-              <w:lastRenderedPageBreak/>
-              <w:t>ج- روشهاي اجرايي انجام پروژه :</w:t>
-            </w:r>
-          </w:p>
-          <w:p>
-            <w:pPr>
-              <w:rPr>
-                <w:rFonts w:ascii="2Lotus_8_0_04061440" w:hAnsi="2Lotus_8_0_04061440" w:cs="B Mitra"/>
-                <w:sz w:val="28"/>
-                <w:szCs w:val="28"/>
-                <w:rtl/>
-              </w:rPr>
-            </w:pPr>
-          </w:p>
-          <w:p>
-            <w:pPr>
-              <w:rPr>
-                <w:rFonts w:ascii="2Lotus_8_0_04061440" w:hAnsi="2Lotus_8_0_04061440" w:cs="B Mitra"/>
-                <w:sz w:val="28"/>
-                <w:szCs w:val="28"/>
-                <w:rtl/>
-              </w:rPr>
-            </w:pPr>
-          </w:p>
-          <w:p>
-            <w:pPr>
-              <w:rPr>
-                <w:rFonts w:ascii="2Lotus_8_0_04061440" w:hAnsi="2Lotus_8_0_04061440" w:cs="B Mitra"/>
-                <w:sz w:val="28"/>
-                <w:szCs w:val="28"/>
-                <w:rtl/>
-              </w:rPr>
-            </w:pPr>
-          </w:p>
-          <w:p>
-            <w:pPr>
-              <w:rPr>
-                <w:rFonts w:ascii="2Lotus_8_0_04061440" w:hAnsi="2Lotus_8_0_04061440" w:cs="B Mitra"/>
-                <w:sz w:val="28"/>
-                <w:szCs w:val="28"/>
-                <w:rtl/>
-              </w:rPr>
-            </w:pPr>
-          </w:p>
-          <w:p>
-            <w:pPr>
-              <w:rPr>
-                <w:rFonts w:ascii="2Lotus_8_0_04061440" w:hAnsi="2Lotus_8_0_04061440" w:cs="B Mitra"/>
-                <w:sz w:val="28"/>
-                <w:szCs w:val="28"/>
-                <w:rtl/>
-              </w:rPr>
-            </w:pPr>
-          </w:p>
-          <w:p>
-            <w:pPr>
-              <w:rPr>
-                <w:rFonts w:ascii="2Lotus_8_0_04061440" w:hAnsi="2Lotus_8_0_04061440" w:cs="B Mitra"/>
-                <w:sz w:val="28"/>
-                <w:szCs w:val="28"/>
-                <w:rtl/>
-              </w:rPr>
-            </w:pPr>
-            <w:r>
-              <w:rPr>
-                <w:rFonts w:ascii="2Lotus_8_0_04061440" w:hAnsi="2Lotus_8_0_04061440" w:cs="B Mitra"/>
-                <w:sz w:val="28"/>
-                <w:szCs w:val="28"/>
-                <w:rtl/>
-              </w:rPr>
-              <w:t>د- برنامه زماني :</w:t>
-            </w:r>
-          </w:p>
-          <w:p>
-            <w:pPr>
-              <w:rPr>
-                <w:rFonts w:ascii="2Lotus_8_0_04061440" w:hAnsi="2Lotus_8_0_04061440" w:cs="B Mitra"/>
-                <w:sz w:val="28"/>
-                <w:szCs w:val="28"/>
-                <w:rtl/>
-              </w:rPr>
-            </w:pPr>
-          </w:p>
-          <w:p>
-            <w:pPr>
-              <w:rPr>
-                <w:rFonts w:ascii="2Lotus_8_0_04061440" w:hAnsi="2Lotus_8_0_04061440" w:cs="B Mitra"/>
-                <w:sz w:val="28"/>
-                <w:szCs w:val="28"/>
-                <w:rtl/>
-              </w:rPr>
-            </w:pPr>
-          </w:p>
-          <w:p>
-            <w:pPr>
-              <w:rPr>
-                <w:rFonts w:ascii="2Lotus_8_0_04061440" w:hAnsi="2Lotus_8_0_04061440" w:cs="B Mitra"/>
-                <w:sz w:val="28"/>
-                <w:szCs w:val="28"/>
-                <w:rtl/>
-              </w:rPr>
-            </w:pPr>
-          </w:p>
-          <w:p>
-            <w:pPr>
-              <w:rPr>
-                <w:rFonts w:ascii="2Lotus_8_0_04061440" w:hAnsi="2Lotus_8_0_04061440" w:cs="B Mitra"/>
-                <w:sz w:val="28"/>
-                <w:szCs w:val="28"/>
-                <w:rtl/>
-              </w:rPr>
-            </w:pPr>
-          </w:p>
-          <w:p>
-            <w:pPr>
-              <w:rPr>
-                <w:rFonts w:ascii="2Lotus_8_0_04061440" w:hAnsi="2Lotus_8_0_04061440" w:cs="B Mitra"/>
-                <w:sz w:val="28"/>
-                <w:szCs w:val="28"/>
-                <w:rtl/>
-              </w:rPr>
-            </w:pPr>
-          </w:p>
-          <w:p>
-            <w:pPr>
-              <w:rPr>
-                <w:rFonts w:ascii="2Lotus_8_0_04061440" w:hAnsi="2Lotus_8_0_04061440" w:cs="B Mitra"/>
-                <w:sz w:val="28"/>
-                <w:szCs w:val="28"/>
-                <w:rtl/>
-              </w:rPr>
-            </w:pPr>
-            <w:r>
-              <w:rPr>
-                <w:rFonts w:ascii="2Lotus_8_0_04061440" w:hAnsi="2Lotus_8_0_04061440" w:cs="B Mitra"/>
-                <w:sz w:val="28"/>
-                <w:szCs w:val="28"/>
-                <w:rtl/>
-              </w:rPr>
-              <w:t>ه- پروژه در ارتباط با کدام سازمان، واحد صنعتي، پروژه کارشناسي يا آزمايشگاه مي باشد .</w:t>
-            </w:r>
-          </w:p>
-          <w:p>
-            <w:pPr>
-              <w:rPr>
-                <w:rFonts w:ascii="2Lotus_8_0_04061440" w:hAnsi="2Lotus_8_0_04061440" w:cs="B Mitra"/>
-                <w:sz w:val="28"/>
-                <w:szCs w:val="28"/>
-                <w:rtl/>
-              </w:rPr>
-            </w:pPr>
-          </w:p>
-          <w:p>
-            <w:pPr>
-              <w:rPr>
-                <w:rFonts w:ascii="2Lotus_8_0_04061440" w:hAnsi="2Lotus_8_0_04061440" w:cs="B Mitra"/>
-                <w:sz w:val="28"/>
-                <w:szCs w:val="28"/>
-                <w:rtl/>
-              </w:rPr>
-            </w:pPr>
-          </w:p>
-          <w:p>
-            <w:pPr>
-              <w:rPr>
-                <w:rFonts w:ascii="2Lotus_8_0_04061440" w:hAnsi="2Lotus_8_0_04061440" w:cs="B Mitra"/>
-                <w:sz w:val="28"/>
-                <w:szCs w:val="28"/>
-                <w:rtl/>
-              </w:rPr>
-            </w:pPr>
-          </w:p>
-          <w:p>
-            <w:pPr>
-              <w:rPr>
-                <w:rFonts w:ascii="2Lotus_8_0_04061440" w:hAnsi="2Lotus_8_0_04061440" w:cs="B Mitra"/>
-                <w:sz w:val="28"/>
-                <w:szCs w:val="28"/>
-                <w:rtl/>
-              </w:rPr>
-            </w:pPr>
-          </w:p>
-          <w:p>
-            <w:pPr>
-              <w:rPr>
-                <w:rFonts w:ascii="2Lotus_8_0_04061440" w:hAnsi="2Lotus_8_0_04061440" w:cs="B Mitra"/>
-                <w:sz w:val="28"/>
-                <w:szCs w:val="28"/>
-                <w:rtl/>
-              </w:rPr>
-            </w:pPr>
-          </w:p>
-          <w:p>
-            <w:pPr>
-              <w:rPr>
-                <w:rFonts w:ascii="2Lotus_8_0_04061440" w:hAnsi="2Lotus_8_0_04061440" w:cs="B Mitra"/>
-                <w:sz w:val="28"/>
-                <w:szCs w:val="28"/>
-                <w:rtl/>
-              </w:rPr>
-            </w:pPr>
-            <w:r>
-              <w:rPr>
-                <w:rFonts w:ascii="2Lotus_8_0_04061440" w:hAnsi="2Lotus_8_0_04061440" w:cs="B Mitra"/>
-                <w:sz w:val="28"/>
-                <w:szCs w:val="28"/>
-                <w:rtl/>
-              </w:rPr>
-              <w:t>و- مراجع :</w:t>
-            </w:r>
-          </w:p>
-          <w:p>
-            <w:pPr>
-              <w:rPr>
-                <w:rFonts w:ascii="2Lotus_8_0_04061440" w:hAnsi="2Lotus_8_0_04061440" w:cs="B Mitra"/>
-                <w:sz w:val="28"/>
-                <w:szCs w:val="28"/>
-                <w:rtl/>
-              </w:rPr>
-            </w:pPr>
-          </w:p>
-          <w:p>
-            <w:pPr>
-              <w:rPr>
-                <w:rFonts w:ascii="2Lotus_8_0_04061440" w:hAnsi="2Lotus_8_0_04061440" w:cs="B Mitra"/>
-                <w:sz w:val="28"/>
-                <w:szCs w:val="28"/>
-                <w:rtl/>
-              </w:rPr>
-            </w:pPr>
-          </w:p>
-          <w:p>
-            <w:pPr>
-              <w:rPr>
-                <w:rFonts w:ascii="2Lotus_8_0_04061440" w:hAnsi="2Lotus_8_0_04061440" w:cs="B Mitra"/>
-                <w:sz w:val="28"/>
-                <w:szCs w:val="28"/>
-                <w:rtl/>
-              </w:rPr>
-            </w:pPr>
-          </w:p>
-          <w:p>
-            <w:pPr>
-              <w:rPr>
-                <w:rFonts w:ascii="2Lotus_8_0_04061440" w:hAnsi="2Lotus_8_0_04061440" w:cs="B Mitra"/>
-                <w:sz w:val="28"/>
-                <w:szCs w:val="28"/>
-                <w:rtl/>
-              </w:rPr>
-            </w:pPr>
-          </w:p>
-          <w:p>
-            <w:pPr>
-              <w:rPr>
-                <w:rFonts w:ascii="2Lotus_8_0_04061440" w:hAnsi="2Lotus_8_0_04061440" w:cs="B Mitra"/>
-                <w:sz w:val="28"/>
-                <w:szCs w:val="28"/>
-                <w:rtl/>
-              </w:rPr>
-            </w:pPr>
+            <w:r/>
+          </w:p>
+          <w:p>
+            <w:pPr>
+              <w:bidi w:val="1"/>
+              <w:jc w:val="right"/>
+            </w:pPr>
+            <w:r>
+              <w:rPr>
+                <w:b/>
+              </w:rPr>
+              <w:t>ج- روش‌های اجرایی انجام پروژه:</w:t>
+              <w:br/>
+            </w:r>
+            <w:r>
+              <w:t>۱. پیاده‌سازی کرنل‌های فیوزشده ترایتون (Fused SVD Triton Kernels) جهت اجرای نگاشت‌های کم‌مرتبه در SRAM پردازنده گرافیکی.</w:t>
+              <w:br/>
+              <w:t>۲. استفاده از بهینه‌سازی منیفلدی ریماین برای حفظ تعامد پایه‌های تبدیل و پایداری عددی.</w:t>
+              <w:br/>
+              <w:t>۳. تخصیص پویای مرتبه با استفاده از آنتروپی طیفی مقادیر منفرد و انطباق باقی‌مانده طیفی (Res-SVD).</w:t>
+              <w:br/>
+              <w:t>۴. اعمال گیت‌های نمایی وابسته به داده برای جلوگیری از واگرایی ماتریس‌های بازگشتی.</w:t>
+              <w:br/>
+              <w:t>۵. ارزیابی تجربی روی مدل‌های DistilBERT, RoBERTa, GPT-2 و Qwen در بنچ‌مارک‌های استاندارد GLUE (شامل SST-2, MRPC, CoLA).</w:t>
+            </w:r>
+          </w:p>
+          <w:p>
+            <w:pPr>
+              <w:bidi w:val="1"/>
+              <w:jc w:val="right"/>
+            </w:pPr>
+            <w:r>
+              <w:rPr>
+                <w:b/>
+              </w:rPr>
+              <w:br/>
+              <w:t>د- برنامه زمانی:</w:t>
+              <w:br/>
+            </w:r>
+            <w:r>
+              <w:t>• ماه ۱ و ۲: تحلیل تئوری مقالات و مدل‌سازی تجزیه مقادیر منفرد (SVD).</w:t>
+              <w:br/>
+              <w:t>• ماه ۳ و ۴: توسعه معماری فریم‌ورک، تزریق خودکار وزن‌ها و پیاده‌سازی کرنل‌های محاسباتی.</w:t>
+              <w:br/>
+              <w:t>• ماه ۵ و ۶: اجرای بنچ‌مارک‌های جامع کیفی و ارزیابی مصرف حافظه و تاخیر روی سرور GPU.</w:t>
+              <w:br/>
+              <w:t>• ماه ۷: جمع‌بندی داده‌ها، استخراج نتایج آماری و نگارش پایان‌نامه کارشناسی جهت دفاع.</w:t>
+            </w:r>
+          </w:p>
+          <w:p>
+            <w:pPr>
+              <w:bidi w:val="1"/>
+              <w:jc w:val="right"/>
+            </w:pPr>
+            <w:r>
+              <w:rPr>
+                <w:b/>
+              </w:rPr>
+              <w:br/>
+              <w:t>ه- پروژه در ارتباط با کدام سازمان، واحد صنعتی، پروژه کارشناسی یا آزمایشگاه می‌باشد:</w:t>
+              <w:br/>
+            </w:r>
+            <w:r>
+              <w:t>آزمایشگاه پژوهشی هوش مصنوعی و سیستم‌های هوشمند، دانشکده مهندسی برق و کامپیوتر دانشگاه تهران.</w:t>
+            </w:r>
+          </w:p>
+          <w:p>
+            <w:pPr>
+              <w:bidi w:val="1"/>
+              <w:jc w:val="right"/>
+            </w:pPr>
+            <w:r>
+              <w:rPr>
+                <w:b/>
+              </w:rPr>
+              <w:br/>
+              <w:t>و- مراجع:</w:t>
+              <w:br/>
+            </w:r>
+            <w:r>
+              <w:t>[1] A. Katharopoulos, et al., "Transformers are RNNs: Fast Autoregressive Transformers with Linear Attention," ICML, 2020.</w:t>
+              <w:br/>
+              <w:t>[2] A. Gu and T. Dao, "Mamba: Linear-Time Sequence Modeling with Selective State Spaces," arXiv:2312.00752, 2023.</w:t>
+              <w:br/>
+              <w:t>[3] T. Dao, "FlashAttention-2: Faster Attention with Better Parallelism and Work Partitioning," ICLR, 2024.</w:t>
+              <w:br/>
+              <w:t>[4] S. Wang, et al., "Linformer: Self-Attention with Linear Complexity," arXiv:2006.04768, 2020.</w:t>
+              <w:br/>
+              <w:t>[5] E. J. Hu, et al., "LoRA: Low-Rank Adaptation of Large Language Models," ICLR, 2022.</w:t>
+            </w:r>
           </w:p>
         </w:tc>
       </w:tr>
@@ -1376,70 +937,69 @@
             <w:tcW w:w="10774" w:type="dxa"/>
           </w:tcPr>
           <w:p>
-            <w:pPr>
-              <w:rPr>
-                <w:rFonts w:ascii="2Lotus_8_0_04061440" w:hAnsi="2Lotus_8_0_04061440" w:cs="B Mitra"/>
-                <w:sz w:val="28"/>
-                <w:szCs w:val="28"/>
-                <w:rtl/>
-              </w:rPr>
-            </w:pPr>
-            <w:r>
-              <w:rPr>
-                <w:rFonts w:ascii="2Lotus_8_0_04061440" w:hAnsi="2Lotus_8_0_04061440" w:cs="B Mitra"/>
-                <w:sz w:val="28"/>
-                <w:szCs w:val="28"/>
-                <w:rtl/>
-              </w:rPr>
-              <w:t xml:space="preserve">6- </w:t>
-            </w:r>
-            <w:r>
-              <w:rPr>
-                <w:rFonts w:ascii="2Lotus_8_0_04061440" w:hAnsi="2Lotus_8_0_04061440" w:cs="B Mitra"/>
-                <w:sz w:val="28"/>
-                <w:szCs w:val="28"/>
-                <w:u w:val="single"/>
-                <w:rtl/>
-              </w:rPr>
-              <w:t>تارخ و امضاء دانشجو و استاد راهنما</w:t>
-            </w:r>
-            <w:r>
-              <w:rPr>
-                <w:rFonts w:ascii="2Lotus_8_0_04061440" w:hAnsi="2Lotus_8_0_04061440" w:cs="B Mitra"/>
-                <w:sz w:val="28"/>
-                <w:szCs w:val="28"/>
-                <w:rtl/>
-              </w:rPr>
-              <w:t xml:space="preserve"> :</w:t>
-            </w:r>
-          </w:p>
-          <w:p>
-            <w:pPr>
-              <w:rPr>
-                <w:rFonts w:ascii="2Lotus_8_0_04061440" w:hAnsi="2Lotus_8_0_04061440" w:cs="B Mitra"/>
-                <w:sz w:val="28"/>
-                <w:szCs w:val="28"/>
-                <w:rtl/>
-              </w:rPr>
-            </w:pPr>
-          </w:p>
-          <w:p>
-            <w:pPr>
-              <w:rPr>
-                <w:rFonts w:ascii="2Lotus_8_0_04061440" w:hAnsi="2Lotus_8_0_04061440" w:cs="B Mitra"/>
-                <w:sz w:val="28"/>
-                <w:szCs w:val="28"/>
-                <w:rtl/>
-              </w:rPr>
-            </w:pPr>
-            <w:r>
-              <w:rPr>
-                <w:rFonts w:ascii="2Lotus_8_0_04061440" w:hAnsi="2Lotus_8_0_04061440" w:cs="B Mitra"/>
-                <w:sz w:val="28"/>
-                <w:szCs w:val="28"/>
-                <w:rtl/>
-              </w:rPr>
-              <w:t>دانشجو :                                   تاريخ :                                   استاد راهنما :                               تاريخ :</w:t>
+            <w:r/>
+          </w:p>
+          <w:p>
+            <w:pPr>
+              <w:bidi w:val="1"/>
+              <w:jc w:val="right"/>
+            </w:pPr>
+            <w:r>
+              <w:rPr>
+                <w:b/>
+                <w:sz w:val="22"/>
+              </w:rPr>
+              <w:t>6- تاریخ و امضاء دانشجو و استاد راهنما:</w:t>
+              <w:br/>
+            </w:r>
+          </w:p>
+          <w:p>
+            <w:pPr>
+              <w:bidi w:val="1"/>
+              <w:jc w:val="right"/>
+            </w:pPr>
+            <w:r>
+              <w:rPr>
+                <w:b/>
+              </w:rPr>
+              <w:t xml:space="preserve">امضاء دانشجو: </w:t>
+            </w:r>
+            <w:r>
+              <w:drawing>
+                <wp:inline xmlns:a="http://schemas.openxmlformats.org/drawingml/2006/main" xmlns:pic="http://schemas.openxmlformats.org/drawingml/2006/picture">
+                  <wp:extent cx="594360" cy="902457"/>
+                  <wp:docPr id="6" name="Picture 6"/>
+                  <wp:cNvGraphicFramePr>
+                    <a:graphicFrameLocks noChangeAspect="1"/>
+                  </wp:cNvGraphicFramePr>
+                  <a:graphic>
+                    <a:graphicData uri="http://schemas.openxmlformats.org/drawingml/2006/picture">
+                      <pic:pic>
+                        <pic:nvPicPr>
+                          <pic:cNvPr id="0" name="signature_pure.png"/>
+                          <pic:cNvPicPr/>
+                        </pic:nvPicPr>
+                        <pic:blipFill>
+                          <a:blip r:embed="rId10"/>
+                          <a:stretch>
+                            <a:fillRect/>
+                          </a:stretch>
+                        </pic:blipFill>
+                        <pic:spPr>
+                          <a:xfrm>
+                            <a:off x="0" y="0"/>
+                            <a:ext cx="594360" cy="902457"/>
+                          </a:xfrm>
+                          <a:prstGeom prst="rect"/>
+                        </pic:spPr>
+                      </pic:pic>
+                    </a:graphicData>
+                  </a:graphic>
+                </wp:inline>
+              </w:drawing>
+            </w:r>
+            <w:r>
+              <w:t xml:space="preserve">        تاریخ: ۱۴۰۵/۰۶/۲۰                          امضاء استاد راهنما:                                       تاریخ: </w:t>
             </w:r>
           </w:p>
         </w:tc>

</xml_diff>

<commit_message>
chore: snapshot all GPU work and thesis updates before sync
</commit_message>
<xml_diff>
--- a/proposal/فرم پروپوزال کارشناسی.docx
+++ b/proposal/فرم پروپوزال کارشناسی.docx
@@ -381,22 +381,38 @@
             <w:gridSpan w:val="4"/>
           </w:tcPr>
           <w:p>
-            <w:pPr>
-              <w:rPr>
-                <w:rFonts w:ascii="2Lotus_8_0_04061440" w:hAnsi="2Lotus_8_0_04061440" w:cs="B Mitra"/>
-                <w:sz w:val="28"/>
-                <w:szCs w:val="28"/>
-                <w:rtl/>
-              </w:rPr>
-            </w:pPr>
-            <w:r>
-              <w:rPr>
-                <w:rFonts w:ascii="2Lotus_8_0_04061440" w:hAnsi="2Lotus_8_0_04061440" w:cs="B Mitra"/>
-                <w:sz w:val="28"/>
-                <w:szCs w:val="28"/>
-                <w:rtl/>
-              </w:rPr>
-              <w:t>1- عنوان پروژه کارشناسي</w:t>
+            <w:r/>
+          </w:p>
+          <w:p>
+            <w:pPr>
+              <w:bidi w:val="1"/>
+              <w:jc w:val="right"/>
+            </w:pPr>
+            <w:r>
+              <w:rPr>
+                <w:b/>
+                <w:sz w:val="22"/>
+              </w:rPr>
+              <w:t xml:space="preserve">1- عنوان پروژه کارشناسی: </w:t>
+            </w:r>
+            <w:r>
+              <w:rPr>
+                <w:sz w:val="22"/>
+              </w:rPr>
+              <w:t>طراحی، ارزیابی تجربی و فشرده‌سازی مکانیزم‌های توجه خطی و تجزیه مقادیر منفرد (SVD) در مدل‌های زبانی بزرگ مبتنی بر ترنسفورمر</w:t>
+            </w:r>
+          </w:p>
+          <w:p>
+            <w:pPr>
+              <w:jc w:val="left"/>
+            </w:pPr>
+            <w:r>
+              <w:rPr>
+                <w:rFonts w:ascii="Times New Roman" w:hAnsi="Times New Roman"/>
+                <w:i/>
+                <w:sz w:val="20"/>
+              </w:rPr>
+              <w:t>NeuralOps: A Hardware-Aware Framework for SVD Linear Attention and Transformer Model Compression</w:t>
             </w:r>
           </w:p>
         </w:tc>
@@ -582,14 +598,9 @@
             <w:tcW w:w="2621" w:type="dxa"/>
           </w:tcPr>
           <w:p>
-            <w:pPr>
-              <w:rPr>
-                <w:rFonts w:ascii="2Lotus_8_0_04061440" w:hAnsi="2Lotus_8_0_04061440" w:cs="B Mitra"/>
-                <w:sz w:val="28"/>
-                <w:szCs w:val="28"/>
-                <w:rtl/>
-              </w:rPr>
-            </w:pPr>
+            <w:r>
+              <w:t>دکتر احمد کلهر</w:t>
+            </w:r>
           </w:p>
         </w:tc>
         <w:tc>
@@ -597,14 +608,9 @@
             <w:tcW w:w="2831" w:type="dxa"/>
           </w:tcPr>
           <w:p>
-            <w:pPr>
-              <w:rPr>
-                <w:rFonts w:ascii="2Lotus_8_0_04061440" w:hAnsi="2Lotus_8_0_04061440" w:cs="B Mitra"/>
-                <w:sz w:val="28"/>
-                <w:szCs w:val="28"/>
-                <w:rtl/>
-              </w:rPr>
-            </w:pPr>
+            <w:r>
+              <w:t>استادیار / دانشیار</w:t>
+            </w:r>
           </w:p>
         </w:tc>
         <w:tc>
@@ -613,14 +619,9 @@
             <w:gridSpan w:val="2"/>
           </w:tcPr>
           <w:p>
-            <w:pPr>
-              <w:rPr>
-                <w:rFonts w:ascii="2Lotus_8_0_04061440" w:hAnsi="2Lotus_8_0_04061440" w:cs="B Mitra"/>
-                <w:sz w:val="28"/>
-                <w:szCs w:val="28"/>
-                <w:rtl/>
-              </w:rPr>
-            </w:pPr>
+            <w:r>
+              <w:t>دانشکده مهندسی برق و کامپیوتر</w:t>
+            </w:r>
           </w:p>
         </w:tc>
       </w:tr>
@@ -657,14 +658,9 @@
             <w:tcW w:w="2621" w:type="dxa"/>
           </w:tcPr>
           <w:p>
-            <w:pPr>
-              <w:rPr>
-                <w:rFonts w:ascii="2Lotus_8_0_04061440" w:hAnsi="2Lotus_8_0_04061440" w:cs="B Mitra"/>
-                <w:sz w:val="28"/>
-                <w:szCs w:val="28"/>
-                <w:rtl/>
-              </w:rPr>
-            </w:pPr>
+            <w:r>
+              <w:t>تعیین توسط گروه آموزش</w:t>
+            </w:r>
           </w:p>
         </w:tc>
         <w:tc>
@@ -672,14 +668,9 @@
             <w:tcW w:w="2831" w:type="dxa"/>
           </w:tcPr>
           <w:p>
-            <w:pPr>
-              <w:rPr>
-                <w:rFonts w:ascii="2Lotus_8_0_04061440" w:hAnsi="2Lotus_8_0_04061440" w:cs="B Mitra"/>
-                <w:sz w:val="28"/>
-                <w:szCs w:val="28"/>
-                <w:rtl/>
-              </w:rPr>
-            </w:pPr>
+            <w:r>
+              <w:t>-</w:t>
+            </w:r>
           </w:p>
         </w:tc>
         <w:tc>
@@ -688,14 +679,9 @@
             <w:gridSpan w:val="2"/>
           </w:tcPr>
           <w:p>
-            <w:pPr>
-              <w:rPr>
-                <w:rFonts w:ascii="2Lotus_8_0_04061440" w:hAnsi="2Lotus_8_0_04061440" w:cs="B Mitra"/>
-                <w:sz w:val="28"/>
-                <w:szCs w:val="28"/>
-                <w:rtl/>
-              </w:rPr>
-            </w:pPr>
+            <w:r>
+              <w:t>دانشکده مهندسی برق و کامپیوتر</w:t>
+            </w:r>
           </w:p>
         </w:tc>
       </w:tr>
@@ -711,72 +697,30 @@
             <w:gridSpan w:val="4"/>
           </w:tcPr>
           <w:p>
-            <w:pPr>
-              <w:rPr>
-                <w:rFonts w:ascii="2Lotus_8_0_04061440" w:hAnsi="2Lotus_8_0_04061440" w:cs="B Mitra"/>
-                <w:sz w:val="28"/>
-                <w:szCs w:val="28"/>
-                <w:rtl/>
-              </w:rPr>
-            </w:pPr>
-            <w:r>
-              <w:rPr>
-                <w:rFonts w:ascii="2Lotus_8_0_04061440" w:hAnsi="2Lotus_8_0_04061440" w:cs="B Mitra"/>
-                <w:sz w:val="28"/>
-                <w:szCs w:val="28"/>
-                <w:rtl/>
-              </w:rPr>
-              <w:t xml:space="preserve">3- </w:t>
-            </w:r>
-            <w:r>
-              <w:rPr>
-                <w:rFonts w:ascii="2Lotus_8_0_04061440" w:hAnsi="2Lotus_8_0_04061440" w:cs="B Mitra"/>
-                <w:sz w:val="28"/>
-                <w:szCs w:val="28"/>
-                <w:u w:val="single"/>
-                <w:rtl/>
-              </w:rPr>
-              <w:t>مشخصات دانشجو</w:t>
-            </w:r>
-          </w:p>
-          <w:p>
-            <w:pPr>
-              <w:rPr>
-                <w:rFonts w:ascii="2Lotus_8_0_04061440" w:hAnsi="2Lotus_8_0_04061440" w:cs="B Mitra"/>
-                <w:sz w:val="28"/>
-                <w:szCs w:val="28"/>
-                <w:rtl/>
-              </w:rPr>
-            </w:pPr>
-          </w:p>
-          <w:p>
-            <w:pPr>
-              <w:rPr>
-                <w:rFonts w:ascii="2Lotus_8_0_04061440" w:hAnsi="2Lotus_8_0_04061440" w:cs="B Mitra"/>
-                <w:sz w:val="16"/>
-                <w:szCs w:val="16"/>
-                <w:rtl/>
-              </w:rPr>
-            </w:pPr>
-            <w:r>
-              <w:rPr>
-                <w:rFonts w:ascii="2Lotus_8_0_04061440" w:hAnsi="2Lotus_8_0_04061440" w:cs="B Mitra"/>
-                <w:sz w:val="28"/>
-                <w:szCs w:val="28"/>
-                <w:rtl/>
-              </w:rPr>
-              <w:t>نام و نام خانوادگي :                                  شماره دانشجويي :                                    رشته و گرايش :</w:t>
-            </w:r>
-          </w:p>
-          <w:p>
-            <w:pPr>
-              <w:rPr>
-                <w:rFonts w:ascii="2Lotus_8_0_04061440" w:hAnsi="2Lotus_8_0_04061440" w:cs="B Mitra"/>
-                <w:sz w:val="16"/>
-                <w:szCs w:val="16"/>
-                <w:rtl/>
-              </w:rPr>
-            </w:pPr>
+            <w:r/>
+          </w:p>
+          <w:p>
+            <w:pPr>
+              <w:bidi w:val="1"/>
+              <w:jc w:val="right"/>
+            </w:pPr>
+            <w:r>
+              <w:rPr>
+                <w:b/>
+                <w:sz w:val="22"/>
+              </w:rPr>
+              <w:t>3- مشخصات دانشجو:</w:t>
+              <w:br/>
+            </w:r>
+          </w:p>
+          <w:p>
+            <w:pPr>
+              <w:bidi w:val="1"/>
+              <w:jc w:val="right"/>
+            </w:pPr>
+            <w:r>
+              <w:t>نام و نام خانوادگی: محمد طاها مجلسی      |      شماره دانشجویی: 810101504      |      رشته و گرایش: مهندسی کامپیوتر - نرم‌افزار</w:t>
+            </w:r>
           </w:p>
         </w:tc>
       </w:tr>
@@ -792,62 +736,18 @@
             <w:gridSpan w:val="4"/>
           </w:tcPr>
           <w:p>
-            <w:pPr>
-              <w:rPr>
-                <w:rFonts w:ascii="2Lotus_8_0_04061440" w:hAnsi="2Lotus_8_0_04061440" w:cs="B Mitra"/>
-                <w:sz w:val="28"/>
-                <w:szCs w:val="28"/>
-                <w:rtl/>
-              </w:rPr>
-            </w:pPr>
-            <w:r>
-              <w:rPr>
-                <w:rFonts w:ascii="2Lotus_8_0_04061440" w:hAnsi="2Lotus_8_0_04061440" w:cs="B Mitra"/>
-                <w:sz w:val="28"/>
-                <w:szCs w:val="28"/>
-                <w:rtl/>
-              </w:rPr>
-              <w:t>4- نيمسال اخذ واحد پروژه : نيم سال اول /  دوم سال تحصيلي :</w:t>
-            </w:r>
-          </w:p>
-          <w:p>
-            <w:pPr>
-              <w:rPr>
-                <w:rFonts w:ascii="2Lotus_8_0_04061440" w:hAnsi="2Lotus_8_0_04061440" w:cs="B Mitra"/>
-                <w:sz w:val="28"/>
-                <w:szCs w:val="28"/>
-                <w:rtl/>
-              </w:rPr>
-            </w:pPr>
-          </w:p>
-          <w:p>
-            <w:pPr>
-              <w:rPr>
-                <w:rFonts w:ascii="2Lotus_8_0_04061440" w:hAnsi="2Lotus_8_0_04061440" w:cs="B Mitra"/>
-                <w:sz w:val="16"/>
-                <w:szCs w:val="16"/>
-                <w:rtl/>
-              </w:rPr>
-            </w:pPr>
-            <w:r>
-              <w:rPr>
-                <w:rFonts w:ascii="2Lotus_8_0_04061440" w:hAnsi="2Lotus_8_0_04061440" w:cs="B Mitra"/>
-                <w:sz w:val="28"/>
-                <w:szCs w:val="28"/>
-                <w:rtl/>
-              </w:rPr>
-              <w:t>توضيح مهم : اين فرم بايد تا قبل از پايان مهلت حذف و اضافه نيمسال مربوط تکميل شود .</w:t>
-            </w:r>
-          </w:p>
-          <w:p>
-            <w:pPr>
-              <w:rPr>
-                <w:rFonts w:ascii="2Lotus_8_0_04061440" w:hAnsi="2Lotus_8_0_04061440" w:cs="B Mitra"/>
-                <w:sz w:val="16"/>
-                <w:szCs w:val="16"/>
-                <w:rtl/>
-              </w:rPr>
-            </w:pPr>
+            <w:r/>
+          </w:p>
+          <w:p>
+            <w:pPr>
+              <w:bidi w:val="1"/>
+              <w:jc w:val="right"/>
+            </w:pPr>
+            <w:r>
+              <w:t>4- نیمسال اخذ واحد پروژه: نیم‌سال دوم سال تحصیلی 1404-1405 (بهار 1405)</w:t>
+              <w:br/>
+              <w:t>توضیح مهم: این فرم باید تا قبل از پایان مهلت حذف و اضافه نیمسال مربوط تکمیل شود.</w:t>
+            </w:r>
           </w:p>
         </w:tc>
       </w:tr>
@@ -863,208 +763,54 @@
             <w:gridSpan w:val="4"/>
           </w:tcPr>
           <w:p>
-            <w:pPr>
-              <w:rPr>
-                <w:rFonts w:ascii="2Lotus_8_0_04061440" w:hAnsi="2Lotus_8_0_04061440" w:cs="B Mitra"/>
-                <w:sz w:val="28"/>
-                <w:szCs w:val="28"/>
-                <w:rtl/>
-              </w:rPr>
-            </w:pPr>
-            <w:r>
-              <w:rPr>
-                <w:rFonts w:ascii="2Lotus_8_0_04061440" w:hAnsi="2Lotus_8_0_04061440" w:cs="B Mitra"/>
-                <w:sz w:val="28"/>
-                <w:szCs w:val="28"/>
-                <w:rtl/>
-              </w:rPr>
-              <w:t xml:space="preserve">5- </w:t>
-            </w:r>
-            <w:r>
-              <w:rPr>
-                <w:rFonts w:ascii="2Lotus_8_0_04061440" w:hAnsi="2Lotus_8_0_04061440" w:cs="B Mitra"/>
-                <w:sz w:val="28"/>
-                <w:szCs w:val="28"/>
-                <w:u w:val="single"/>
-                <w:rtl/>
-              </w:rPr>
-              <w:t>اطلاعات مربوط به پروژه</w:t>
-            </w:r>
-            <w:r>
-              <w:rPr>
-                <w:rFonts w:ascii="2Lotus_8_0_04061440" w:hAnsi="2Lotus_8_0_04061440" w:cs="B Mitra"/>
-                <w:sz w:val="28"/>
-                <w:szCs w:val="28"/>
-                <w:rtl/>
-              </w:rPr>
-              <w:t xml:space="preserve"> :</w:t>
-            </w:r>
-          </w:p>
-          <w:p>
-            <w:pPr>
-              <w:rPr>
-                <w:rFonts w:ascii="2Lotus_8_0_04061440" w:hAnsi="2Lotus_8_0_04061440" w:cs="B Mitra"/>
-                <w:sz w:val="28"/>
-                <w:szCs w:val="28"/>
-                <w:rtl/>
-              </w:rPr>
-            </w:pPr>
-            <w:r>
-              <w:rPr>
-                <w:rFonts w:ascii="2Lotus_8_0_04061440" w:hAnsi="2Lotus_8_0_04061440" w:cs="B Mitra"/>
-                <w:sz w:val="28"/>
-                <w:szCs w:val="28"/>
-                <w:rtl/>
-              </w:rPr>
-              <w:t>لف- تعريف مساله :</w:t>
-            </w:r>
-          </w:p>
-          <w:p>
-            <w:pPr>
-              <w:rPr>
-                <w:rFonts w:ascii="2Lotus_8_0_04061440" w:hAnsi="2Lotus_8_0_04061440" w:cs="B Mitra"/>
-                <w:sz w:val="28"/>
-                <w:szCs w:val="28"/>
-                <w:rtl/>
-              </w:rPr>
-            </w:pPr>
-          </w:p>
-          <w:p>
-            <w:pPr>
-              <w:rPr>
-                <w:rFonts w:ascii="2Lotus_8_0_04061440" w:hAnsi="2Lotus_8_0_04061440" w:cs="B Mitra"/>
-                <w:sz w:val="28"/>
-                <w:szCs w:val="28"/>
-                <w:rtl/>
-              </w:rPr>
-            </w:pPr>
-          </w:p>
-          <w:p>
-            <w:pPr>
-              <w:rPr>
-                <w:rFonts w:ascii="2Lotus_8_0_04061440" w:hAnsi="2Lotus_8_0_04061440" w:cs="B Mitra"/>
-                <w:sz w:val="28"/>
-                <w:szCs w:val="28"/>
-                <w:rtl/>
-              </w:rPr>
-            </w:pPr>
-          </w:p>
-          <w:p>
-            <w:pPr>
-              <w:rPr>
-                <w:rFonts w:ascii="2Lotus_8_0_04061440" w:hAnsi="2Lotus_8_0_04061440" w:cs="B Mitra"/>
-                <w:sz w:val="28"/>
-                <w:szCs w:val="28"/>
-                <w:rtl/>
-              </w:rPr>
-            </w:pPr>
-          </w:p>
-          <w:p>
-            <w:pPr>
-              <w:rPr>
-                <w:rFonts w:ascii="2Lotus_8_0_04061440" w:hAnsi="2Lotus_8_0_04061440" w:cs="B Mitra"/>
-                <w:sz w:val="28"/>
-                <w:szCs w:val="28"/>
-                <w:rtl/>
-              </w:rPr>
-            </w:pPr>
-          </w:p>
-          <w:p>
-            <w:pPr>
-              <w:rPr>
-                <w:rFonts w:ascii="2Lotus_8_0_04061440" w:hAnsi="2Lotus_8_0_04061440" w:cs="B Mitra"/>
-                <w:sz w:val="28"/>
-                <w:szCs w:val="28"/>
-                <w:rtl/>
-              </w:rPr>
-            </w:pPr>
-          </w:p>
-          <w:p>
-            <w:pPr>
-              <w:rPr>
-                <w:rFonts w:ascii="2Lotus_8_0_04061440" w:hAnsi="2Lotus_8_0_04061440" w:cs="B Mitra"/>
-                <w:sz w:val="28"/>
-                <w:szCs w:val="28"/>
-                <w:rtl/>
-              </w:rPr>
-            </w:pPr>
-          </w:p>
-          <w:p>
-            <w:pPr>
-              <w:rPr>
-                <w:rFonts w:ascii="2Lotus_8_0_04061440" w:hAnsi="2Lotus_8_0_04061440" w:cs="B Mitra"/>
-                <w:sz w:val="28"/>
-                <w:szCs w:val="28"/>
-                <w:rtl/>
-              </w:rPr>
-            </w:pPr>
-          </w:p>
-          <w:p>
-            <w:pPr>
-              <w:rPr>
-                <w:rFonts w:ascii="2Lotus_8_0_04061440" w:hAnsi="2Lotus_8_0_04061440" w:cs="B Mitra"/>
-                <w:sz w:val="28"/>
-                <w:szCs w:val="28"/>
-                <w:rtl/>
-              </w:rPr>
-            </w:pPr>
-            <w:r>
-              <w:rPr>
-                <w:rFonts w:ascii="2Lotus_8_0_04061440" w:hAnsi="2Lotus_8_0_04061440" w:cs="B Mitra"/>
-                <w:sz w:val="28"/>
-                <w:szCs w:val="28"/>
-                <w:rtl/>
-              </w:rPr>
-              <w:t>ب- هدف از طرح مورد نظر ضرو</w:t>
-            </w:r>
-            <w:r>
-              <w:rPr>
-                <w:rFonts w:ascii="2Lotus_8_0_04061440" w:hAnsi="2Lotus_8_0_04061440" w:cs="B Mitra" w:hint="cs"/>
-                <w:sz w:val="28"/>
-                <w:szCs w:val="28"/>
-                <w:rtl/>
-              </w:rPr>
-              <w:t>ر</w:t>
-            </w:r>
-            <w:r>
-              <w:rPr>
-                <w:rFonts w:ascii="2Lotus_8_0_04061440" w:hAnsi="2Lotus_8_0_04061440" w:cs="B Mitra"/>
-                <w:sz w:val="28"/>
-                <w:szCs w:val="28"/>
-                <w:rtl/>
-              </w:rPr>
-              <w:t>ت انجام آن :</w:t>
-            </w:r>
-          </w:p>
-          <w:p>
-            <w:pPr>
-              <w:rPr>
-                <w:rFonts w:ascii="2Lotus_8_0_04061440" w:hAnsi="2Lotus_8_0_04061440" w:cs="B Mitra"/>
-                <w:sz w:val="28"/>
-                <w:szCs w:val="28"/>
-                <w:rtl/>
-              </w:rPr>
-            </w:pPr>
-          </w:p>
-          <w:p>
-            <w:pPr>
-              <w:rPr>
-                <w:rFonts w:ascii="2Lotus_8_0_04061440" w:hAnsi="2Lotus_8_0_04061440" w:cs="B Mitra"/>
-                <w:sz w:val="28"/>
-                <w:szCs w:val="28"/>
-                <w:rtl/>
-              </w:rPr>
-            </w:pPr>
-          </w:p>
-          <w:p>
-            <w:pPr>
-              <w:rPr>
-                <w:rFonts w:ascii="2Lotus_8_0_04061440" w:hAnsi="2Lotus_8_0_04061440" w:cs="B Mitra"/>
-                <w:sz w:val="28"/>
-                <w:szCs w:val="28"/>
-                <w:rtl/>
-              </w:rPr>
-            </w:pPr>
+            <w:r/>
+          </w:p>
+          <w:p>
+            <w:pPr>
+              <w:bidi w:val="1"/>
+              <w:jc w:val="right"/>
+            </w:pPr>
+            <w:r>
+              <w:rPr>
+                <w:b/>
+                <w:sz w:val="22"/>
+              </w:rPr>
+              <w:t>5- اطلاعات مربوط به پروژه:</w:t>
+              <w:br/>
+            </w:r>
+          </w:p>
+          <w:p>
+            <w:pPr>
+              <w:bidi w:val="1"/>
+              <w:jc w:val="right"/>
+            </w:pPr>
+            <w:r>
+              <w:rPr>
+                <w:b/>
+              </w:rPr>
+              <w:t>الف- تعریف مسأله:</w:t>
+              <w:br/>
+            </w:r>
+            <w:r>
+              <w:t>مدل‌های زبانی بزرگ مبتنی بر ترنسفورمر به دلیل استفاده از مکانیزم توجه استاندارد (Softmax Self-Attention)، با پیچیدگی محاسباتی و حافظه‌ای درجه‌دو (O(N²)) مواجه هستند که گلوگاه شدیدی در طول دنباله‌های بلند و استقرار روی کارت‌های گرافیکی ایجاد می‌کند. رویکردهای نوین توجه خطی و تقریب‌های کم‌مرتبه SVD اگرچه از نظر تئوری خطی O(N) هستند، در پیاده‌سازی سخت‌افزاری به دلیل افت نسبت محاسبات به حافظه (Arithmetic Intensity) و اشباع حالت در دنباله‌های طولانی دچار افت سرعت و پایداری می‌شوند.</w:t>
+            </w:r>
+          </w:p>
+          <w:p>
+            <w:pPr>
+              <w:bidi w:val="1"/>
+              <w:jc w:val="right"/>
+            </w:pPr>
+            <w:r>
+              <w:rPr>
+                <w:b/>
+              </w:rPr>
+              <w:br/>
+              <w:t>ب- هدف از طرح مورد نظر و ضرورت انجام آن:</w:t>
+              <w:br/>
+            </w:r>
+            <w:r>
+              <w:t>توسعه چارچوب یکپارچه و سخت‌افزار-آگاه (Hardware-Aware) به نام NeuralOps جهت تزریق، فشرده‌سازی و ارزیابی تجربی بیش از ۲۰۰ مکانیزم توجه خطی و موتور فشرده‌سازی مبتنی بر SVD در ترنسفورمرها. ضرورت این پژوهش در کاهش تاخیر تا ۵۰٪ و مصرف حافظه تا ۴۰٪ در کنار حفظ بیش از ۹۸٪ دقت تسک‌های زبانی جهت اجرای بهینه مدل‌ها روی سیستم‌های توزیع‌شده و پردازنده‌های گرافیکی محدود است.</w:t>
+            </w:r>
           </w:p>
         </w:tc>
       </w:tr>
@@ -1089,281 +835,96 @@
             <w:tcW w:w="10774" w:type="dxa"/>
           </w:tcPr>
           <w:p>
-            <w:pPr>
-              <w:rPr>
-                <w:rFonts w:ascii="2Lotus_8_0_04061440" w:hAnsi="2Lotus_8_0_04061440" w:cs="B Mitra"/>
-                <w:sz w:val="28"/>
-                <w:szCs w:val="28"/>
-                <w:rtl/>
-              </w:rPr>
-            </w:pPr>
-            <w:r>
-              <w:rPr>
-                <w:rFonts w:ascii="2Lotus_8_0_04061440" w:hAnsi="2Lotus_8_0_04061440" w:cs="B Mitra"/>
-                <w:sz w:val="28"/>
-                <w:szCs w:val="28"/>
-                <w:rtl/>
-              </w:rPr>
-              <w:lastRenderedPageBreak/>
-              <w:t>ج- روشهاي اجرايي انجام پروژه :</w:t>
-            </w:r>
-          </w:p>
-          <w:p>
-            <w:pPr>
-              <w:rPr>
-                <w:rFonts w:ascii="2Lotus_8_0_04061440" w:hAnsi="2Lotus_8_0_04061440" w:cs="B Mitra"/>
-                <w:sz w:val="28"/>
-                <w:szCs w:val="28"/>
-                <w:rtl/>
-              </w:rPr>
-            </w:pPr>
-          </w:p>
-          <w:p>
-            <w:pPr>
-              <w:rPr>
-                <w:rFonts w:ascii="2Lotus_8_0_04061440" w:hAnsi="2Lotus_8_0_04061440" w:cs="B Mitra"/>
-                <w:sz w:val="28"/>
-                <w:szCs w:val="28"/>
-                <w:rtl/>
-              </w:rPr>
-            </w:pPr>
-          </w:p>
-          <w:p>
-            <w:pPr>
-              <w:rPr>
-                <w:rFonts w:ascii="2Lotus_8_0_04061440" w:hAnsi="2Lotus_8_0_04061440" w:cs="B Mitra"/>
-                <w:sz w:val="28"/>
-                <w:szCs w:val="28"/>
-                <w:rtl/>
-              </w:rPr>
-            </w:pPr>
-          </w:p>
-          <w:p>
-            <w:pPr>
-              <w:rPr>
-                <w:rFonts w:ascii="2Lotus_8_0_04061440" w:hAnsi="2Lotus_8_0_04061440" w:cs="B Mitra"/>
-                <w:sz w:val="28"/>
-                <w:szCs w:val="28"/>
-                <w:rtl/>
-              </w:rPr>
-            </w:pPr>
-          </w:p>
-          <w:p>
-            <w:pPr>
-              <w:rPr>
-                <w:rFonts w:ascii="2Lotus_8_0_04061440" w:hAnsi="2Lotus_8_0_04061440" w:cs="B Mitra"/>
-                <w:sz w:val="28"/>
-                <w:szCs w:val="28"/>
-                <w:rtl/>
-              </w:rPr>
-            </w:pPr>
-          </w:p>
-          <w:p>
-            <w:pPr>
-              <w:rPr>
-                <w:rFonts w:ascii="2Lotus_8_0_04061440" w:hAnsi="2Lotus_8_0_04061440" w:cs="B Mitra"/>
-                <w:sz w:val="28"/>
-                <w:szCs w:val="28"/>
-                <w:rtl/>
-              </w:rPr>
-            </w:pPr>
-            <w:r>
-              <w:rPr>
-                <w:rFonts w:ascii="2Lotus_8_0_04061440" w:hAnsi="2Lotus_8_0_04061440" w:cs="B Mitra"/>
-                <w:sz w:val="28"/>
-                <w:szCs w:val="28"/>
-                <w:rtl/>
-              </w:rPr>
-              <w:t>د- برنامه زماني :</w:t>
-            </w:r>
-          </w:p>
-          <w:p>
-            <w:pPr>
-              <w:rPr>
-                <w:rFonts w:ascii="2Lotus_8_0_04061440" w:hAnsi="2Lotus_8_0_04061440" w:cs="B Mitra"/>
-                <w:sz w:val="28"/>
-                <w:szCs w:val="28"/>
-                <w:rtl/>
-              </w:rPr>
-            </w:pPr>
-          </w:p>
-          <w:p>
-            <w:pPr>
-              <w:rPr>
-                <w:rFonts w:ascii="2Lotus_8_0_04061440" w:hAnsi="2Lotus_8_0_04061440" w:cs="B Mitra"/>
-                <w:sz w:val="28"/>
-                <w:szCs w:val="28"/>
-                <w:rtl/>
-              </w:rPr>
-            </w:pPr>
-          </w:p>
-          <w:p>
-            <w:pPr>
-              <w:rPr>
-                <w:rFonts w:ascii="2Lotus_8_0_04061440" w:hAnsi="2Lotus_8_0_04061440" w:cs="B Mitra"/>
-                <w:sz w:val="28"/>
-                <w:szCs w:val="28"/>
-                <w:rtl/>
-              </w:rPr>
-            </w:pPr>
-          </w:p>
-          <w:p>
-            <w:pPr>
-              <w:rPr>
-                <w:rFonts w:ascii="2Lotus_8_0_04061440" w:hAnsi="2Lotus_8_0_04061440" w:cs="B Mitra"/>
-                <w:sz w:val="28"/>
-                <w:szCs w:val="28"/>
-                <w:rtl/>
-              </w:rPr>
-            </w:pPr>
-          </w:p>
-          <w:p>
-            <w:pPr>
-              <w:rPr>
-                <w:rFonts w:ascii="2Lotus_8_0_04061440" w:hAnsi="2Lotus_8_0_04061440" w:cs="B Mitra"/>
-                <w:sz w:val="28"/>
-                <w:szCs w:val="28"/>
-                <w:rtl/>
-              </w:rPr>
-            </w:pPr>
-          </w:p>
-          <w:p>
-            <w:pPr>
-              <w:rPr>
-                <w:rFonts w:ascii="2Lotus_8_0_04061440" w:hAnsi="2Lotus_8_0_04061440" w:cs="B Mitra"/>
-                <w:sz w:val="28"/>
-                <w:szCs w:val="28"/>
-                <w:rtl/>
-              </w:rPr>
-            </w:pPr>
-            <w:r>
-              <w:rPr>
-                <w:rFonts w:ascii="2Lotus_8_0_04061440" w:hAnsi="2Lotus_8_0_04061440" w:cs="B Mitra"/>
-                <w:sz w:val="28"/>
-                <w:szCs w:val="28"/>
-                <w:rtl/>
-              </w:rPr>
-              <w:t>ه- پروژه در ارتباط با کدام سازمان، واحد صنعتي، پروژه کارشناسي يا آزمايشگاه مي باشد .</w:t>
-            </w:r>
-          </w:p>
-          <w:p>
-            <w:pPr>
-              <w:rPr>
-                <w:rFonts w:ascii="2Lotus_8_0_04061440" w:hAnsi="2Lotus_8_0_04061440" w:cs="B Mitra"/>
-                <w:sz w:val="28"/>
-                <w:szCs w:val="28"/>
-                <w:rtl/>
-              </w:rPr>
-            </w:pPr>
-          </w:p>
-          <w:p>
-            <w:pPr>
-              <w:rPr>
-                <w:rFonts w:ascii="2Lotus_8_0_04061440" w:hAnsi="2Lotus_8_0_04061440" w:cs="B Mitra"/>
-                <w:sz w:val="28"/>
-                <w:szCs w:val="28"/>
-                <w:rtl/>
-              </w:rPr>
-            </w:pPr>
-          </w:p>
-          <w:p>
-            <w:pPr>
-              <w:rPr>
-                <w:rFonts w:ascii="2Lotus_8_0_04061440" w:hAnsi="2Lotus_8_0_04061440" w:cs="B Mitra"/>
-                <w:sz w:val="28"/>
-                <w:szCs w:val="28"/>
-                <w:rtl/>
-              </w:rPr>
-            </w:pPr>
-          </w:p>
-          <w:p>
-            <w:pPr>
-              <w:rPr>
-                <w:rFonts w:ascii="2Lotus_8_0_04061440" w:hAnsi="2Lotus_8_0_04061440" w:cs="B Mitra"/>
-                <w:sz w:val="28"/>
-                <w:szCs w:val="28"/>
-                <w:rtl/>
-              </w:rPr>
-            </w:pPr>
-          </w:p>
-          <w:p>
-            <w:pPr>
-              <w:rPr>
-                <w:rFonts w:ascii="2Lotus_8_0_04061440" w:hAnsi="2Lotus_8_0_04061440" w:cs="B Mitra"/>
-                <w:sz w:val="28"/>
-                <w:szCs w:val="28"/>
-                <w:rtl/>
-              </w:rPr>
-            </w:pPr>
-          </w:p>
-          <w:p>
-            <w:pPr>
-              <w:rPr>
-                <w:rFonts w:ascii="2Lotus_8_0_04061440" w:hAnsi="2Lotus_8_0_04061440" w:cs="B Mitra"/>
-                <w:sz w:val="28"/>
-                <w:szCs w:val="28"/>
-                <w:rtl/>
-              </w:rPr>
-            </w:pPr>
-            <w:r>
-              <w:rPr>
-                <w:rFonts w:ascii="2Lotus_8_0_04061440" w:hAnsi="2Lotus_8_0_04061440" w:cs="B Mitra"/>
-                <w:sz w:val="28"/>
-                <w:szCs w:val="28"/>
-                <w:rtl/>
-              </w:rPr>
-              <w:t>و- مراجع :</w:t>
-            </w:r>
-          </w:p>
-          <w:p>
-            <w:pPr>
-              <w:rPr>
-                <w:rFonts w:ascii="2Lotus_8_0_04061440" w:hAnsi="2Lotus_8_0_04061440" w:cs="B Mitra"/>
-                <w:sz w:val="28"/>
-                <w:szCs w:val="28"/>
-                <w:rtl/>
-              </w:rPr>
-            </w:pPr>
-          </w:p>
-          <w:p>
-            <w:pPr>
-              <w:rPr>
-                <w:rFonts w:ascii="2Lotus_8_0_04061440" w:hAnsi="2Lotus_8_0_04061440" w:cs="B Mitra"/>
-                <w:sz w:val="28"/>
-                <w:szCs w:val="28"/>
-                <w:rtl/>
-              </w:rPr>
-            </w:pPr>
-          </w:p>
-          <w:p>
-            <w:pPr>
-              <w:rPr>
-                <w:rFonts w:ascii="2Lotus_8_0_04061440" w:hAnsi="2Lotus_8_0_04061440" w:cs="B Mitra"/>
-                <w:sz w:val="28"/>
-                <w:szCs w:val="28"/>
-                <w:rtl/>
-              </w:rPr>
-            </w:pPr>
-          </w:p>
-          <w:p>
-            <w:pPr>
-              <w:rPr>
-                <w:rFonts w:ascii="2Lotus_8_0_04061440" w:hAnsi="2Lotus_8_0_04061440" w:cs="B Mitra"/>
-                <w:sz w:val="28"/>
-                <w:szCs w:val="28"/>
-                <w:rtl/>
-              </w:rPr>
-            </w:pPr>
-          </w:p>
-          <w:p>
-            <w:pPr>
-              <w:rPr>
-                <w:rFonts w:ascii="2Lotus_8_0_04061440" w:hAnsi="2Lotus_8_0_04061440" w:cs="B Mitra"/>
-                <w:sz w:val="28"/>
-                <w:szCs w:val="28"/>
-                <w:rtl/>
-              </w:rPr>
-            </w:pPr>
+            <w:r/>
+          </w:p>
+          <w:p>
+            <w:pPr>
+              <w:bidi w:val="1"/>
+              <w:jc w:val="right"/>
+            </w:pPr>
+            <w:r>
+              <w:rPr>
+                <w:b/>
+              </w:rPr>
+              <w:t>ج- روش‌های اجرایی انجام پروژه:</w:t>
+              <w:br/>
+            </w:r>
+            <w:r>
+              <w:t>۱. پیاده‌سازی کرنل‌های فیوزشده ترایتون (Fused SVD Triton Kernels) جهت اجرای نگاشت‌های کم‌مرتبه در SRAM پردازنده گرافیکی.</w:t>
+              <w:br/>
+              <w:t>۲. استفاده از بهینه‌سازی منیفلدی ریماین برای حفظ تعامد پایه‌های تبدیل و پایداری عددی.</w:t>
+              <w:br/>
+              <w:t>۳. تخصیص پویای مرتبه با استفاده از آنتروپی طیفی مقادیر منفرد و انطباق باقی‌مانده طیفی (Res-SVD).</w:t>
+              <w:br/>
+              <w:t>۴. اعمال گیت‌های نمایی وابسته به داده برای جلوگیری از واگرایی ماتریس‌های بازگشتی.</w:t>
+              <w:br/>
+              <w:t>۵. ارزیابی تجربی روی مدل‌های DistilBERT, RoBERTa, GPT-2 و Qwen در بنچ‌مارک‌های استاندارد GLUE (شامل SST-2, MRPC, CoLA).</w:t>
+            </w:r>
+          </w:p>
+          <w:p>
+            <w:pPr>
+              <w:bidi w:val="1"/>
+              <w:jc w:val="right"/>
+            </w:pPr>
+            <w:r>
+              <w:rPr>
+                <w:b/>
+              </w:rPr>
+              <w:br/>
+              <w:t>د- برنامه زمانی:</w:t>
+              <w:br/>
+            </w:r>
+            <w:r>
+              <w:t>• ماه ۱ و ۲: تحلیل تئوری مقالات و مدل‌سازی تجزیه مقادیر منفرد (SVD).</w:t>
+              <w:br/>
+              <w:t>• ماه ۳ و ۴: توسعه معماری فریم‌ورک، تزریق خودکار وزن‌ها و پیاده‌سازی کرنل‌های محاسباتی.</w:t>
+              <w:br/>
+              <w:t>• ماه ۵ و ۶: اجرای بنچ‌مارک‌های جامع کیفی و ارزیابی مصرف حافظه و تاخیر روی سرور GPU.</w:t>
+              <w:br/>
+              <w:t>• ماه ۷: جمع‌بندی داده‌ها، استخراج نتایج آماری و نگارش پایان‌نامه کارشناسی جهت دفاع.</w:t>
+            </w:r>
+          </w:p>
+          <w:p>
+            <w:pPr>
+              <w:bidi w:val="1"/>
+              <w:jc w:val="right"/>
+            </w:pPr>
+            <w:r>
+              <w:rPr>
+                <w:b/>
+              </w:rPr>
+              <w:br/>
+              <w:t>ه- پروژه در ارتباط با کدام سازمان، واحد صنعتی، پروژه کارشناسی یا آزمایشگاه می‌باشد:</w:t>
+              <w:br/>
+            </w:r>
+            <w:r>
+              <w:t>آزمایشگاه پژوهشی هوش مصنوعی و سیستم‌های هوشمند، دانشکده مهندسی برق و کامپیوتر دانشگاه تهران.</w:t>
+            </w:r>
+          </w:p>
+          <w:p>
+            <w:pPr>
+              <w:bidi w:val="1"/>
+              <w:jc w:val="right"/>
+            </w:pPr>
+            <w:r>
+              <w:rPr>
+                <w:b/>
+              </w:rPr>
+              <w:br/>
+              <w:t>و- مراجع:</w:t>
+              <w:br/>
+            </w:r>
+            <w:r>
+              <w:t>[1] A. Katharopoulos, et al., "Transformers are RNNs: Fast Autoregressive Transformers with Linear Attention," ICML, 2020.</w:t>
+              <w:br/>
+              <w:t>[2] A. Gu and T. Dao, "Mamba: Linear-Time Sequence Modeling with Selective State Spaces," arXiv:2312.00752, 2023.</w:t>
+              <w:br/>
+              <w:t>[3] T. Dao, "FlashAttention-2: Faster Attention with Better Parallelism and Work Partitioning," ICLR, 2024.</w:t>
+              <w:br/>
+              <w:t>[4] S. Wang, et al., "Linformer: Self-Attention with Linear Complexity," arXiv:2006.04768, 2020.</w:t>
+              <w:br/>
+              <w:t>[5] E. J. Hu, et al., "LoRA: Low-Rank Adaptation of Large Language Models," ICLR, 2022.</w:t>
+            </w:r>
           </w:p>
         </w:tc>
       </w:tr>
@@ -1376,70 +937,69 @@
             <w:tcW w:w="10774" w:type="dxa"/>
           </w:tcPr>
           <w:p>
-            <w:pPr>
-              <w:rPr>
-                <w:rFonts w:ascii="2Lotus_8_0_04061440" w:hAnsi="2Lotus_8_0_04061440" w:cs="B Mitra"/>
-                <w:sz w:val="28"/>
-                <w:szCs w:val="28"/>
-                <w:rtl/>
-              </w:rPr>
-            </w:pPr>
-            <w:r>
-              <w:rPr>
-                <w:rFonts w:ascii="2Lotus_8_0_04061440" w:hAnsi="2Lotus_8_0_04061440" w:cs="B Mitra"/>
-                <w:sz w:val="28"/>
-                <w:szCs w:val="28"/>
-                <w:rtl/>
-              </w:rPr>
-              <w:t xml:space="preserve">6- </w:t>
-            </w:r>
-            <w:r>
-              <w:rPr>
-                <w:rFonts w:ascii="2Lotus_8_0_04061440" w:hAnsi="2Lotus_8_0_04061440" w:cs="B Mitra"/>
-                <w:sz w:val="28"/>
-                <w:szCs w:val="28"/>
-                <w:u w:val="single"/>
-                <w:rtl/>
-              </w:rPr>
-              <w:t>تارخ و امضاء دانشجو و استاد راهنما</w:t>
-            </w:r>
-            <w:r>
-              <w:rPr>
-                <w:rFonts w:ascii="2Lotus_8_0_04061440" w:hAnsi="2Lotus_8_0_04061440" w:cs="B Mitra"/>
-                <w:sz w:val="28"/>
-                <w:szCs w:val="28"/>
-                <w:rtl/>
-              </w:rPr>
-              <w:t xml:space="preserve"> :</w:t>
-            </w:r>
-          </w:p>
-          <w:p>
-            <w:pPr>
-              <w:rPr>
-                <w:rFonts w:ascii="2Lotus_8_0_04061440" w:hAnsi="2Lotus_8_0_04061440" w:cs="B Mitra"/>
-                <w:sz w:val="28"/>
-                <w:szCs w:val="28"/>
-                <w:rtl/>
-              </w:rPr>
-            </w:pPr>
-          </w:p>
-          <w:p>
-            <w:pPr>
-              <w:rPr>
-                <w:rFonts w:ascii="2Lotus_8_0_04061440" w:hAnsi="2Lotus_8_0_04061440" w:cs="B Mitra"/>
-                <w:sz w:val="28"/>
-                <w:szCs w:val="28"/>
-                <w:rtl/>
-              </w:rPr>
-            </w:pPr>
-            <w:r>
-              <w:rPr>
-                <w:rFonts w:ascii="2Lotus_8_0_04061440" w:hAnsi="2Lotus_8_0_04061440" w:cs="B Mitra"/>
-                <w:sz w:val="28"/>
-                <w:szCs w:val="28"/>
-                <w:rtl/>
-              </w:rPr>
-              <w:t>دانشجو :                                   تاريخ :                                   استاد راهنما :                               تاريخ :</w:t>
+            <w:r/>
+          </w:p>
+          <w:p>
+            <w:pPr>
+              <w:bidi w:val="1"/>
+              <w:jc w:val="right"/>
+            </w:pPr>
+            <w:r>
+              <w:rPr>
+                <w:b/>
+                <w:sz w:val="22"/>
+              </w:rPr>
+              <w:t>6- تاریخ و امضاء دانشجو و استاد راهنما:</w:t>
+              <w:br/>
+            </w:r>
+          </w:p>
+          <w:p>
+            <w:pPr>
+              <w:bidi w:val="1"/>
+              <w:jc w:val="right"/>
+            </w:pPr>
+            <w:r>
+              <w:rPr>
+                <w:b/>
+              </w:rPr>
+              <w:t xml:space="preserve">امضاء دانشجو: </w:t>
+            </w:r>
+            <w:r>
+              <w:drawing>
+                <wp:inline xmlns:a="http://schemas.openxmlformats.org/drawingml/2006/main" xmlns:pic="http://schemas.openxmlformats.org/drawingml/2006/picture">
+                  <wp:extent cx="594360" cy="902457"/>
+                  <wp:docPr id="6" name="Picture 6"/>
+                  <wp:cNvGraphicFramePr>
+                    <a:graphicFrameLocks noChangeAspect="1"/>
+                  </wp:cNvGraphicFramePr>
+                  <a:graphic>
+                    <a:graphicData uri="http://schemas.openxmlformats.org/drawingml/2006/picture">
+                      <pic:pic>
+                        <pic:nvPicPr>
+                          <pic:cNvPr id="0" name="signature_pure.png"/>
+                          <pic:cNvPicPr/>
+                        </pic:nvPicPr>
+                        <pic:blipFill>
+                          <a:blip r:embed="rId10"/>
+                          <a:stretch>
+                            <a:fillRect/>
+                          </a:stretch>
+                        </pic:blipFill>
+                        <pic:spPr>
+                          <a:xfrm>
+                            <a:off x="0" y="0"/>
+                            <a:ext cx="594360" cy="902457"/>
+                          </a:xfrm>
+                          <a:prstGeom prst="rect"/>
+                        </pic:spPr>
+                      </pic:pic>
+                    </a:graphicData>
+                  </a:graphic>
+                </wp:inline>
+              </w:drawing>
+            </w:r>
+            <w:r>
+              <w:t xml:space="preserve">        تاریخ: ۱۴۰۵/۰۶/۲۰                          امضاء استاد راهنما:                                       تاریخ: </w:t>
             </w:r>
           </w:p>
         </w:tc>

</xml_diff>